<commit_message>
Validate meeting number format for document 8
Add server-side and client-side validation requiring meeting numbers to use the N/YYYY format, with focused tests covering valid, invalid, blank, and unrelated document values.
</commit_message>
<xml_diff>
--- a/HRCP-KKU-Academic/src/main/resources/templates/docx/doc_4.docx
+++ b/HRCP-KKU-Academic/src/main/resources/templates/docx/doc_4.docx
@@ -873,7 +873,7 @@
       <w:pPr>
         <w:pStyle w:val="ListParagraph"/>
         <w:tabs>
-          <w:tab w:val="left" w:pos="5040"/>
+          <w:tab w:val="left" w:pos="6480"/>
         </w:tabs>
         <w:spacing w:line="240" w:lineRule="auto"/>
         <w:ind w:left="1530"/>
@@ -993,7 +993,7 @@
       <w:pPr>
         <w:pStyle w:val="ListParagraph"/>
         <w:tabs>
-          <w:tab w:val="left" w:pos="5040"/>
+          <w:tab w:val="left" w:pos="6480"/>
         </w:tabs>
         <w:spacing w:line="240" w:lineRule="auto"/>
         <w:ind w:left="1530"/>
@@ -1111,7 +1111,7 @@
       <w:pPr>
         <w:pStyle w:val="ListParagraph"/>
         <w:tabs>
-          <w:tab w:val="left" w:pos="5040"/>
+          <w:tab w:val="left" w:pos="6480"/>
         </w:tabs>
         <w:spacing w:line="240" w:lineRule="auto"/>
         <w:ind w:left="1530"/>

</xml_diff>